<commit_message>
Revisión de documentos: agrega modelo de datos implementado y arquitectura, corrige 1.5 y ajusta referencias
Co-Authored-By: Claude Opus 5.5 (1M context) <noreply@anthropic.com>
Claude-Session: https://claude.ai/code/session_01MrtDhxuMPFWNK4KKuu4tRU
</commit_message>
<xml_diff>
--- a/Fase 1/Evidencias Grupales/1.5_GuiaEstudiante_Fase1_Definicion_Proyecto_APT_Bastian_Reyes.docx
+++ b/Fase 1/Evidencias Grupales/1.5_GuiaEstudiante_Fase1_Definicion_Proyecto_APT_Bastian_Reyes.docx
@@ -352,7 +352,7 @@
         </mc:AlternateContent>
       </w:r>
       <w:r>
-        <w:t>}</w:t>
+        <w:t/>
       </w:r>
     </w:p>
     <w:p/>
@@ -857,7 +857,7 @@
                 <w:szCs w:val="20"/>
                 <w:lang w:eastAsia="es-CL"/>
               </w:rPr>
-              <w:t>Feriaplace</w:t>
+              <w:t>FeriaPlace</w:t>
             </w:r>
           </w:p>
         </w:tc>
@@ -2396,7 +2396,7 @@
                 <w:szCs w:val="20"/>
                 <w:lang w:eastAsia="es-CL"/>
               </w:rPr>
-              <w:t>.</w:t>
+              <w:t/>
             </w:r>
           </w:p>
         </w:tc>
@@ -5004,7 +5004,7 @@
                 <w:szCs w:val="15"/>
                 <w:lang w:val="es-ES"/>
               </w:rPr>
-              <w:t>Entorno de desarrollo, framework web, control de versiones (Git), hosting.</w:t>
+              <w:t>Entorno de desarrollo, framework web, control de versiones (Git y GitHub).</w:t>
             </w:r>
           </w:p>
         </w:tc>

</xml_diff>